<commit_message>
fix: repair resume link, add Internmo role, remove dead code
Resume link pointed at a .docx and only that .docx was tracked, so all
resume PDFs were absent from deployed builds. Repoint to the PDF and
commit it.

Add the Internmo AI Engineer Intern role as the leading experience entry
so the homepage current-role block shows the AI position. Fix the
hardcoded singular label on the experience stat card, which read
"2 / Current role listed" once a second role existed.

Remove 18 orphaned files (13 components, 4 magicui, old site.ts) and 53
lines of dead CSS, all with zero importers after the redesign.

Pin NODE_VERSION=22 and declare @netlify/plugin-nextjs to eliminate the
build environment as a variable in the stale deployment.

Co-Authored-By: Claude Opus 5 <noreply@anthropic.com>
</commit_message>
<xml_diff>
--- a/public/resume/Naman_Manocha_Master_Resume.docx
+++ b/public/resume/Naman_Manocha_Master_Resume.docx
@@ -490,6 +490,298 @@
       </w:pPr>
       <w:r>
         <w:rPr>
+          <w:i/>
+        </w:rPr>
+        <w:t>Solo-built, Apr–Aug 2026 — ~132K lines of code across 752 files, 410 commits, 142+ test suites — submitted to OpenAI Build Week</w:t>
+      </w:r>
+      <w:r>
+        <w:rPr>
+          <w:i/>
+        </w:rPr>
+        <w:t xml:space="preserve">  |  </w:t>
+      </w:r>
+      <w:r>
+        <w:rPr>
+          <w:i/>
+        </w:rPr>
+        <w:t xml:space="preserve">Live: </w:t>
+      </w:r>
+      <w:hyperlink r:id="rId7">
+        <w:r>
+          <w:rPr>
+            <w:color w:val="0066CC"/>
+            <w:u w:val="single"/>
+            <w:i/>
+          </w:rPr>
+          <w:t>www.fundersai.co.in</w:t>
+        </w:r>
+      </w:hyperlink>
+      <w:r>
+        <w:rPr>
+          <w:i/>
+        </w:rPr>
+        <w:t xml:space="preserve"> | </w:t>
+      </w:r>
+      <w:r>
+        <w:rPr>
+          <w:i/>
+        </w:rPr>
+        <w:t xml:space="preserve">Repo: </w:t>
+      </w:r>
+      <w:hyperlink r:id="rId8">
+        <w:r>
+          <w:rPr>
+            <w:color w:val="0066CC"/>
+            <w:u w:val="single"/>
+            <w:i/>
+          </w:rPr>
+          <w:t>github.com/Naman6019/FundersAI</w:t>
+        </w:r>
+      </w:hyperlink>
+    </w:p>
+    <w:p>
+      <w:pPr>
+        <w:pStyle w:val="ListParagraph"/>
+        <w:numPr>
+          <w:ilvl w:val="0"/>
+          <w:numId w:val="2"/>
+        </w:numPr>
+        <w:spacing w:after="45"/>
+      </w:pPr>
+      <w:r>
+        <w:rPr>
+          <w:rFonts w:ascii="Calibri" w:cs="Calibri" w:eastAsia="Calibri" w:hAnsi="Calibri"/>
+          <w:b/>
+          <w:bCs/>
+          <w:i w:val="false"/>
+          <w:iCs w:val="false"/>
+          <w:color w:val="1A1A1A"/>
+          <w:sz w:val="19"/>
+          <w:szCs w:val="19"/>
+        </w:rPr>
+        <w:t xml:space="preserve">Citation-Grounded RAG:</w:t>
+      </w:r>
+      <w:r>
+        <w:rPr>
+          <w:rFonts w:ascii="Calibri" w:cs="Calibri" w:eastAsia="Calibri" w:hAnsi="Calibri"/>
+          <w:i w:val="false"/>
+          <w:iCs w:val="false"/>
+          <w:color w:val="1A1A1A"/>
+          <w:sz w:val="19"/>
+          <w:szCs w:val="19"/>
+        </w:rPr>
+        <w:t xml:space="preserve"> built a 7-node LangGraph pipeline (retrieve → grade → synthesize/abstain, with a query-rewrite loop back into retrieval) over ~10,400 embedded document chunks (OpenAI embeddings, Supabase pgvector) with lexical reranking and strict LLM abstention, eliminating hallucinated financial claims when evidence is insufficient.</w:t>
+      </w:r>
+    </w:p>
+    <w:p>
+      <w:pPr>
+        <w:pStyle w:val="ListParagraph"/>
+        <w:numPr>
+          <w:ilvl w:val="0"/>
+          <w:numId w:val="2"/>
+        </w:numPr>
+        <w:spacing w:after="45"/>
+      </w:pPr>
+      <w:r>
+        <w:rPr>
+          <w:rFonts w:ascii="Calibri" w:cs="Calibri" w:eastAsia="Calibri" w:hAnsi="Calibri"/>
+          <w:b/>
+          <w:bCs/>
+          <w:i w:val="false"/>
+          <w:iCs w:val="false"/>
+          <w:color w:val="1A1A1A"/>
+          <w:sz w:val="19"/>
+          <w:szCs w:val="19"/>
+        </w:rPr>
+        <w:t xml:space="preserve">Explainable ML:</w:t>
+      </w:r>
+      <w:r>
+        <w:rPr>
+          <w:rFonts w:ascii="Calibri" w:cs="Calibri" w:eastAsia="Calibri" w:hAnsi="Calibri"/>
+          <w:i w:val="false"/>
+          <w:iCs w:val="false"/>
+          <w:color w:val="1A1A1A"/>
+          <w:sz w:val="19"/>
+          <w:szCs w:val="19"/>
+        </w:rPr>
+        <w:t xml:space="preserve"> engineered a fund-similarity engine using cosine similarity and k-means clustering over 13 standardized features, plus a logistic-regression triage model (MLflow) for parser-review prioritization.</w:t>
+      </w:r>
+    </w:p>
+    <w:p>
+      <w:pPr>
+        <w:pStyle w:val="ListParagraph"/>
+        <w:numPr>
+          <w:ilvl w:val="0"/>
+          <w:numId w:val="2"/>
+        </w:numPr>
+        <w:spacing w:after="45"/>
+      </w:pPr>
+      <w:r>
+        <w:rPr>
+          <w:rFonts w:ascii="Calibri" w:cs="Calibri" w:eastAsia="Calibri" w:hAnsi="Calibri"/>
+          <w:b/>
+          <w:bCs/>
+          <w:i w:val="false"/>
+          <w:iCs w:val="false"/>
+          <w:color w:val="1A1A1A"/>
+          <w:sz w:val="19"/>
+          <w:szCs w:val="19"/>
+        </w:rPr>
+        <w:t xml:space="preserve">Multi-Agent Orchestration:</w:t>
+      </w:r>
+      <w:r>
+        <w:rPr>
+          <w:rFonts w:ascii="Calibri" w:cs="Calibri" w:eastAsia="Calibri" w:hAnsi="Calibri"/>
+          <w:i w:val="false"/>
+          <w:iCs w:val="false"/>
+          <w:color w:val="1A1A1A"/>
+          <w:sz w:val="19"/>
+          <w:szCs w:val="19"/>
+        </w:rPr>
+        <w:t xml:space="preserve"> designed a custom multi-agent pipeline (Planner → Quant → Research → Synthesis agents) with shared state and real-time streamed status updates, where a Groq-hosted LLM router agent classifies query intent and directs execution across stock, mutual-fund, comparison, and market-news paths.</w:t>
+      </w:r>
+    </w:p>
+    <w:p>
+      <w:pPr>
+        <w:pStyle w:val="ListParagraph"/>
+        <w:numPr>
+          <w:ilvl w:val="0"/>
+          <w:numId w:val="2"/>
+        </w:numPr>
+        <w:spacing w:after="45"/>
+      </w:pPr>
+      <w:r>
+        <w:rPr>
+          <w:rFonts w:ascii="Calibri" w:cs="Calibri" w:eastAsia="Calibri" w:hAnsi="Calibri"/>
+          <w:b/>
+          <w:bCs/>
+          <w:i w:val="false"/>
+          <w:iCs w:val="false"/>
+          <w:color w:val="1A1A1A"/>
+          <w:sz w:val="19"/>
+          <w:szCs w:val="19"/>
+        </w:rPr>
+        <w:t xml:space="preserve">Data-Quality Debugging:</w:t>
+      </w:r>
+      <w:r>
+        <w:rPr>
+          <w:rFonts w:ascii="Calibri" w:cs="Calibri" w:eastAsia="Calibri" w:hAnsi="Calibri"/>
+          <w:i w:val="false"/>
+          <w:iCs w:val="false"/>
+          <w:color w:val="1A1A1A"/>
+          <w:sz w:val="19"/>
+          <w:szCs w:val="19"/>
+        </w:rPr>
+        <w:t xml:space="preserve"> diagnosed and fixed a scheme-name normalizer bug that had collapsed 14,000+ mutual fund records into the wrong peer groups, raising field-level data coverage from as low as 83% to 100% on affected AMCs.</w:t>
+      </w:r>
+    </w:p>
+    <w:p>
+      <w:pPr>
+        <w:pStyle w:val="ListParagraph"/>
+        <w:numPr>
+          <w:ilvl w:val="0"/>
+          <w:numId w:val="2"/>
+        </w:numPr>
+        <w:spacing w:after="45"/>
+      </w:pPr>
+      <w:r>
+        <w:rPr>
+          <w:rFonts w:ascii="Calibri" w:cs="Calibri" w:eastAsia="Calibri" w:hAnsi="Calibri"/>
+          <w:b/>
+          <w:bCs/>
+          <w:i w:val="false"/>
+          <w:iCs w:val="false"/>
+          <w:color w:val="1A1A1A"/>
+          <w:sz w:val="19"/>
+          <w:szCs w:val="19"/>
+        </w:rPr>
+        <w:t xml:space="preserve">Resilient Data Engineering:</w:t>
+      </w:r>
+      <w:r>
+        <w:rPr>
+          <w:rFonts w:ascii="Calibri" w:cs="Calibri" w:eastAsia="Calibri" w:hAnsi="Calibri"/>
+          <w:i w:val="false"/>
+          <w:iCs w:val="false"/>
+          <w:color w:val="1A1A1A"/>
+          <w:sz w:val="19"/>
+          <w:szCs w:val="19"/>
+        </w:rPr>
+        <w:t xml:space="preserve"> built a 22-workflow GitHub Actions pipeline scraping and normalizing official disclosures from 12 AMCs, reaching 99.66% data-readiness across 871 tracked fund schemes.</w:t>
+      </w:r>
+    </w:p>
+    <w:p>
+      <w:pPr>
+        <w:pStyle w:val="ListParagraph"/>
+        <w:numPr>
+          <w:ilvl w:val="0"/>
+          <w:numId w:val="2"/>
+        </w:numPr>
+        <w:spacing w:after="45"/>
+      </w:pPr>
+      <w:r>
+        <w:rPr>
+          <w:rFonts w:ascii="Calibri" w:cs="Calibri" w:eastAsia="Calibri" w:hAnsi="Calibri"/>
+          <w:b/>
+          <w:bCs/>
+          <w:i w:val="false"/>
+          <w:iCs w:val="false"/>
+          <w:color w:val="1A1A1A"/>
+          <w:sz w:val="19"/>
+          <w:szCs w:val="19"/>
+        </w:rPr>
+        <w:t xml:space="preserve">Cloud Storage &amp; Billing:</w:t>
+      </w:r>
+      <w:r>
+        <w:rPr>
+          <w:rFonts w:ascii="Calibri" w:cs="Calibri" w:eastAsia="Calibri" w:hAnsi="Calibri"/>
+          <w:i w:val="false"/>
+          <w:iCs w:val="false"/>
+          <w:color w:val="1A1A1A"/>
+          <w:sz w:val="19"/>
+          <w:szCs w:val="19"/>
+        </w:rPr>
+        <w:t xml:space="preserve"> built an S3-compatible storage layer (Cloudflare R2 via boto3/AWS SigV4, Python + TypeScript) for raw documents and cold archival, and shipped Razorpay subscription billing (webhook-verified, Free/Pro/Ultra) with Supabase Auth row-level security.</w:t>
+      </w:r>
+    </w:p>
+    <w:p>
+      <w:pPr>
+        <w:tabs>
+          <w:tab w:val="right" w:pos="9026"/>
+        </w:tabs>
+        <w:spacing w:after="20" w:before="90"/>
+      </w:pPr>
+      <w:r>
+        <w:rPr>
+          <w:rFonts w:ascii="Calibri" w:cs="Calibri" w:eastAsia="Calibri" w:hAnsi="Calibri"/>
+          <w:b/>
+          <w:bCs/>
+          <w:color w:val="1A1A1A"/>
+          <w:sz w:val="20"/>
+          <w:szCs w:val="20"/>
+        </w:rPr>
+        <w:t xml:space="preserve">FundersAI Reports — Containerized LLM Report-Synthesis Microservice</w:t>
+      </w:r>
+      <w:r>
+        <w:t xml:space="preserve">	</w:t>
+      </w:r>
+      <w:r>
+        <w:rPr>
+          <w:rFonts w:ascii="Calibri" w:cs="Calibri" w:eastAsia="Calibri" w:hAnsi="Calibri"/>
+          <w:i/>
+          <w:iCs/>
+          <w:color w:val="555555"/>
+          <w:sz w:val="19"/>
+          <w:szCs w:val="19"/>
+        </w:rPr>
+        <w:t xml:space="preserve">synthesis.fundersai.co.in</w:t>
+      </w:r>
+    </w:p>
+    <w:p>
+      <w:pPr>
+        <w:spacing w:after="60"/>
+      </w:pPr>
+      <w:r>
+        <w:rPr>
           <w:rFonts w:ascii="Calibri" w:cs="Calibri" w:eastAsia="Calibri" w:hAnsi="Calibri"/>
           <w:i/>
           <w:iCs/>
@@ -497,211 +789,109 @@
           <w:sz w:val="18"/>
           <w:szCs w:val="18"/>
         </w:rPr>
-        <w:t xml:space="preserve">Solo-built, Apr–Aug 2026 — ~98K lines of code across 527 files, 375 commits, 664 backend + 58 frontend tests — submitted to OpenAI Build Week</w:t>
-      </w:r>
-    </w:p>
-    <w:p>
-      <w:pPr>
-        <w:pStyle w:val="ListParagraph"/>
-        <w:numPr>
-          <w:ilvl w:val="0"/>
-          <w:numId w:val="2"/>
-        </w:numPr>
-        <w:spacing w:after="45"/>
-      </w:pPr>
-      <w:r>
-        <w:rPr>
-          <w:rFonts w:ascii="Calibri" w:cs="Calibri" w:eastAsia="Calibri" w:hAnsi="Calibri"/>
-          <w:b/>
-          <w:bCs/>
-          <w:i w:val="false"/>
-          <w:iCs w:val="false"/>
-          <w:color w:val="1A1A1A"/>
-          <w:sz w:val="19"/>
-          <w:szCs w:val="19"/>
-        </w:rPr>
-        <w:t xml:space="preserve">Citation-Grounded RAG:</w:t>
-      </w:r>
-      <w:r>
-        <w:rPr>
-          <w:rFonts w:ascii="Calibri" w:cs="Calibri" w:eastAsia="Calibri" w:hAnsi="Calibri"/>
-          <w:i w:val="false"/>
-          <w:iCs w:val="false"/>
-          <w:color w:val="1A1A1A"/>
-          <w:sz w:val="19"/>
-          <w:szCs w:val="19"/>
-        </w:rPr>
-        <w:t xml:space="preserve"> built a 7-node LangGraph pipeline (retrieve → grade → synthesize/abstain, with a query-rewrite loop back into retrieval) over ~10,400 embedded document chunks (OpenAI embeddings, Supabase pgvector) with lexical reranking and strict LLM abstention, eliminating hallucinated financial claims when evidence is insufficient.</w:t>
-      </w:r>
-    </w:p>
-    <w:p>
-      <w:pPr>
-        <w:pStyle w:val="ListParagraph"/>
-        <w:numPr>
-          <w:ilvl w:val="0"/>
-          <w:numId w:val="2"/>
-        </w:numPr>
-        <w:spacing w:after="45"/>
-      </w:pPr>
-      <w:r>
-        <w:rPr>
-          <w:rFonts w:ascii="Calibri" w:cs="Calibri" w:eastAsia="Calibri" w:hAnsi="Calibri"/>
-          <w:b/>
-          <w:bCs/>
-          <w:i w:val="false"/>
-          <w:iCs w:val="false"/>
-          <w:color w:val="1A1A1A"/>
-          <w:sz w:val="19"/>
-          <w:szCs w:val="19"/>
-        </w:rPr>
-        <w:t xml:space="preserve">Explainable ML:</w:t>
-      </w:r>
-      <w:r>
-        <w:rPr>
-          <w:rFonts w:ascii="Calibri" w:cs="Calibri" w:eastAsia="Calibri" w:hAnsi="Calibri"/>
-          <w:i w:val="false"/>
-          <w:iCs w:val="false"/>
-          <w:color w:val="1A1A1A"/>
-          <w:sz w:val="19"/>
-          <w:szCs w:val="19"/>
-        </w:rPr>
-        <w:t xml:space="preserve"> engineered a fund-similarity engine using cosine similarity and k-means clustering over 13 standardized features, plus a logistic-regression triage model (MLflow) for parser-review prioritization.</w:t>
-      </w:r>
-    </w:p>
-    <w:p>
-      <w:pPr>
-        <w:pStyle w:val="ListParagraph"/>
-        <w:numPr>
-          <w:ilvl w:val="0"/>
-          <w:numId w:val="2"/>
-        </w:numPr>
-        <w:spacing w:after="45"/>
-      </w:pPr>
-      <w:r>
-        <w:rPr>
-          <w:rFonts w:ascii="Calibri" w:cs="Calibri" w:eastAsia="Calibri" w:hAnsi="Calibri"/>
-          <w:b/>
-          <w:bCs/>
-          <w:i w:val="false"/>
-          <w:iCs w:val="false"/>
-          <w:color w:val="1A1A1A"/>
-          <w:sz w:val="19"/>
-          <w:szCs w:val="19"/>
-        </w:rPr>
-        <w:t xml:space="preserve">Multi-Agent Orchestration:</w:t>
-      </w:r>
-      <w:r>
-        <w:rPr>
-          <w:rFonts w:ascii="Calibri" w:cs="Calibri" w:eastAsia="Calibri" w:hAnsi="Calibri"/>
-          <w:i w:val="false"/>
-          <w:iCs w:val="false"/>
-          <w:color w:val="1A1A1A"/>
-          <w:sz w:val="19"/>
-          <w:szCs w:val="19"/>
-        </w:rPr>
-        <w:t xml:space="preserve"> designed a custom multi-agent pipeline (Planner → Quant → Research → Synthesis agents) with shared state and real-time streamed status updates, where a Groq-hosted LLM router agent classifies query intent and directs execution across stock, mutual-fund, comparison, and market-news paths.</w:t>
-      </w:r>
-    </w:p>
-    <w:p>
-      <w:pPr>
-        <w:pStyle w:val="ListParagraph"/>
-        <w:numPr>
-          <w:ilvl w:val="0"/>
-          <w:numId w:val="2"/>
-        </w:numPr>
-        <w:spacing w:after="45"/>
-      </w:pPr>
-      <w:r>
-        <w:rPr>
-          <w:rFonts w:ascii="Calibri" w:cs="Calibri" w:eastAsia="Calibri" w:hAnsi="Calibri"/>
-          <w:b/>
-          <w:bCs/>
-          <w:i w:val="false"/>
-          <w:iCs w:val="false"/>
-          <w:color w:val="1A1A1A"/>
-          <w:sz w:val="19"/>
-          <w:szCs w:val="19"/>
-        </w:rPr>
-        <w:t xml:space="preserve">Data-Quality Debugging:</w:t>
-      </w:r>
-      <w:r>
-        <w:rPr>
-          <w:rFonts w:ascii="Calibri" w:cs="Calibri" w:eastAsia="Calibri" w:hAnsi="Calibri"/>
-          <w:i w:val="false"/>
-          <w:iCs w:val="false"/>
-          <w:color w:val="1A1A1A"/>
-          <w:sz w:val="19"/>
-          <w:szCs w:val="19"/>
-        </w:rPr>
-        <w:t xml:space="preserve"> diagnosed and fixed a scheme-name normalizer bug that had collapsed 14,000+ mutual fund records into the wrong peer groups, raising field-level data coverage from as low as 83% to 100% on affected AMCs.</w:t>
-      </w:r>
-    </w:p>
-    <w:p>
-      <w:pPr>
-        <w:pStyle w:val="ListParagraph"/>
-        <w:numPr>
-          <w:ilvl w:val="0"/>
-          <w:numId w:val="2"/>
-        </w:numPr>
-        <w:spacing w:after="45"/>
-      </w:pPr>
-      <w:r>
-        <w:rPr>
-          <w:rFonts w:ascii="Calibri" w:cs="Calibri" w:eastAsia="Calibri" w:hAnsi="Calibri"/>
-          <w:b/>
-          <w:bCs/>
-          <w:i w:val="false"/>
-          <w:iCs w:val="false"/>
-          <w:color w:val="1A1A1A"/>
-          <w:sz w:val="19"/>
-          <w:szCs w:val="19"/>
-        </w:rPr>
-        <w:t xml:space="preserve">Resilient Data Engineering:</w:t>
-      </w:r>
-      <w:r>
-        <w:rPr>
-          <w:rFonts w:ascii="Calibri" w:cs="Calibri" w:eastAsia="Calibri" w:hAnsi="Calibri"/>
-          <w:i w:val="false"/>
-          <w:iCs w:val="false"/>
-          <w:color w:val="1A1A1A"/>
-          <w:sz w:val="19"/>
-          <w:szCs w:val="19"/>
-        </w:rPr>
-        <w:t xml:space="preserve"> built a 22-workflow GitHub Actions pipeline scraping and normalizing official disclosures from 12 AMCs, reaching 99.66% data-readiness across 871 tracked fund schemes.</w:t>
-      </w:r>
-    </w:p>
-    <w:p>
-      <w:pPr>
-        <w:pStyle w:val="ListParagraph"/>
-        <w:numPr>
-          <w:ilvl w:val="0"/>
-          <w:numId w:val="2"/>
-        </w:numPr>
-        <w:spacing w:after="45"/>
-      </w:pPr>
-      <w:r>
-        <w:rPr>
-          <w:rFonts w:ascii="Calibri" w:cs="Calibri" w:eastAsia="Calibri" w:hAnsi="Calibri"/>
-          <w:b/>
-          <w:bCs/>
-          <w:i w:val="false"/>
-          <w:iCs w:val="false"/>
-          <w:color w:val="1A1A1A"/>
-          <w:sz w:val="19"/>
-          <w:szCs w:val="19"/>
-        </w:rPr>
-        <w:t xml:space="preserve">Cloud Storage &amp; Billing:</w:t>
-      </w:r>
-      <w:r>
-        <w:rPr>
-          <w:rFonts w:ascii="Calibri" w:cs="Calibri" w:eastAsia="Calibri" w:hAnsi="Calibri"/>
-          <w:i w:val="false"/>
-          <w:iCs w:val="false"/>
-          <w:color w:val="1A1A1A"/>
-          <w:sz w:val="19"/>
-          <w:szCs w:val="19"/>
-        </w:rPr>
-        <w:t xml:space="preserve"> built an S3-compatible storage layer (Cloudflare R2 via boto3/AWS SigV4, Python + TypeScript) for raw documents and cold archival, and shipped Razorpay subscription billing (webhook-verified, Free/Pro/Ultra) with Supabase Auth row-level security.</w:t>
+        <w:t xml:space="preserve">Python, FastAPI, LangGraph, Docker, Kubernetes (K3s), AWS EC2</w:t>
+      </w:r>
+    </w:p>
+    <w:p>
+      <w:pPr>
+        <w:pStyle w:val="ListParagraph"/>
+        <w:numPr>
+          <w:ilvl w:val="0"/>
+          <w:numId w:val="2"/>
+        </w:numPr>
+        <w:spacing w:after="45"/>
+      </w:pPr>
+      <w:r>
+        <w:rPr>
+          <w:rFonts w:ascii="Calibri" w:cs="Calibri" w:eastAsia="Calibri" w:hAnsi="Calibri"/>
+          <w:b/>
+          <w:bCs/>
+          <w:i w:val="false"/>
+          <w:iCs w:val="false"/>
+          <w:color w:val="1A1A1A"/>
+          <w:sz w:val="19"/>
+          <w:szCs w:val="19"/>
+        </w:rPr>
+        <w:t xml:space="preserve">Decoupled Architecture:</w:t>
+      </w:r>
+      <w:r>
+        <w:rPr>
+          <w:rFonts w:ascii="Calibri" w:cs="Calibri" w:eastAsia="Calibri" w:hAnsi="Calibri"/>
+          <w:i w:val="false"/>
+          <w:iCs w:val="false"/>
+          <w:color w:val="1A1A1A"/>
+          <w:sz w:val="19"/>
+          <w:szCs w:val="19"/>
+        </w:rPr>
+        <w:t xml:space="preserve"> extracted report synthesis into a standalone FastAPI + LangGraph service, independently deployable from the main monolith so LLM-heavy generation scales without impacting the core app.</w:t>
+      </w:r>
+    </w:p>
+    <w:p>
+      <w:pPr>
+        <w:pStyle w:val="ListParagraph"/>
+        <w:numPr>
+          <w:ilvl w:val="0"/>
+          <w:numId w:val="2"/>
+        </w:numPr>
+        <w:spacing w:after="45"/>
+      </w:pPr>
+      <w:r>
+        <w:rPr>
+          <w:rFonts w:ascii="Calibri" w:cs="Calibri" w:eastAsia="Calibri" w:hAnsi="Calibri"/>
+          <w:b/>
+          <w:bCs/>
+          <w:i w:val="false"/>
+          <w:iCs w:val="false"/>
+          <w:color w:val="1A1A1A"/>
+          <w:sz w:val="19"/>
+          <w:szCs w:val="19"/>
+        </w:rPr>
+        <w:t xml:space="preserve">Kubernetes Deployment:</w:t>
+      </w:r>
+      <w:r>
+        <w:rPr>
+          <w:rFonts w:ascii="Calibri" w:cs="Calibri" w:eastAsia="Calibri" w:hAnsi="Calibri"/>
+          <w:i w:val="false"/>
+          <w:iCs w:val="false"/>
+          <w:color w:val="1A1A1A"/>
+          <w:sz w:val="19"/>
+          <w:szCs w:val="19"/>
+        </w:rPr>
+        <w:t xml:space="preserve"> provisioned and administered an AWS EC2 instance running K3s, deploying the service as a 2-replica Kubernetes Deployment behind a streaming API for real-time fund-comparison report generation.</w:t>
+      </w:r>
+    </w:p>
+    <w:p>
+      <w:pPr>
+        <w:pStyle w:val="ListParagraph"/>
+        <w:numPr>
+          <w:ilvl w:val="0"/>
+          <w:numId w:val="2"/>
+        </w:numPr>
+        <w:spacing w:after="45"/>
+      </w:pPr>
+      <w:r>
+        <w:rPr>
+          <w:rFonts w:ascii="Calibri" w:cs="Calibri" w:eastAsia="Calibri" w:hAnsi="Calibri"/>
+          <w:b/>
+          <w:bCs/>
+          <w:i w:val="false"/>
+          <w:iCs w:val="false"/>
+          <w:color w:val="1A1A1A"/>
+          <w:sz w:val="19"/>
+          <w:szCs w:val="19"/>
+        </w:rPr>
+        <w:t xml:space="preserve">Infrastructure &amp; Secrets:</w:t>
+      </w:r>
+      <w:r>
+        <w:rPr>
+          <w:rFonts w:ascii="Calibri" w:cs="Calibri" w:eastAsia="Calibri" w:hAnsi="Calibri"/>
+          <w:i w:val="false"/>
+          <w:iCs w:val="false"/>
+          <w:color w:val="1A1A1A"/>
+          <w:sz w:val="19"/>
+          <w:szCs w:val="19"/>
+        </w:rPr>
+        <w:t xml:space="preserve"> configured EC2 security groups/networking and managed credentials (Supabase, OpenAI) via Kubernetes Secrets rather than embedding them in the container image.</w:t>
       </w:r>
     </w:p>
     <w:p>
@@ -720,7 +910,7 @@
           <w:sz w:val="20"/>
           <w:szCs w:val="20"/>
         </w:rPr>
-        <w:t xml:space="preserve">FundersAI Reports — Containerized LLM Report-Synthesis Microservice</w:t>
+        <w:t xml:space="preserve">CareFlow Intelligence — Agentic RAG &amp; Fine-Tuning for Clinical Research</w:t>
       </w:r>
       <w:r>
         <w:t xml:space="preserve">	</w:t>
@@ -734,7 +924,7 @@
           <w:sz w:val="19"/>
           <w:szCs w:val="19"/>
         </w:rPr>
-        <w:t xml:space="preserve">synthesis.fundersai.co.in</w:t>
+        <w:t xml:space="preserve"/>
       </w:r>
     </w:p>
     <w:p>
@@ -750,109 +940,177 @@
           <w:sz w:val="18"/>
           <w:szCs w:val="18"/>
         </w:rPr>
-        <w:t xml:space="preserve">Python, FastAPI, LangGraph, Docker, Kubernetes (K3s), AWS EC2</w:t>
-      </w:r>
-    </w:p>
-    <w:p>
-      <w:pPr>
-        <w:pStyle w:val="ListParagraph"/>
-        <w:numPr>
-          <w:ilvl w:val="0"/>
-          <w:numId w:val="2"/>
-        </w:numPr>
-        <w:spacing w:after="45"/>
-      </w:pPr>
-      <w:r>
-        <w:rPr>
-          <w:rFonts w:ascii="Calibri" w:cs="Calibri" w:eastAsia="Calibri" w:hAnsi="Calibri"/>
-          <w:b/>
-          <w:bCs/>
-          <w:i w:val="false"/>
-          <w:iCs w:val="false"/>
-          <w:color w:val="1A1A1A"/>
-          <w:sz w:val="19"/>
-          <w:szCs w:val="19"/>
-        </w:rPr>
-        <w:t xml:space="preserve">Decoupled Architecture:</w:t>
-      </w:r>
-      <w:r>
-        <w:rPr>
-          <w:rFonts w:ascii="Calibri" w:cs="Calibri" w:eastAsia="Calibri" w:hAnsi="Calibri"/>
-          <w:i w:val="false"/>
-          <w:iCs w:val="false"/>
-          <w:color w:val="1A1A1A"/>
-          <w:sz w:val="19"/>
-          <w:szCs w:val="19"/>
-        </w:rPr>
-        <w:t xml:space="preserve"> extracted report synthesis into a standalone FastAPI + LangGraph service, independently deployable from the main monolith so LLM-heavy generation scales without impacting the core app.</w:t>
-      </w:r>
-    </w:p>
-    <w:p>
-      <w:pPr>
-        <w:pStyle w:val="ListParagraph"/>
-        <w:numPr>
-          <w:ilvl w:val="0"/>
-          <w:numId w:val="2"/>
-        </w:numPr>
-        <w:spacing w:after="45"/>
-      </w:pPr>
-      <w:r>
-        <w:rPr>
-          <w:rFonts w:ascii="Calibri" w:cs="Calibri" w:eastAsia="Calibri" w:hAnsi="Calibri"/>
-          <w:b/>
-          <w:bCs/>
-          <w:i w:val="false"/>
-          <w:iCs w:val="false"/>
-          <w:color w:val="1A1A1A"/>
-          <w:sz w:val="19"/>
-          <w:szCs w:val="19"/>
-        </w:rPr>
-        <w:t xml:space="preserve">Kubernetes Deployment:</w:t>
-      </w:r>
-      <w:r>
-        <w:rPr>
-          <w:rFonts w:ascii="Calibri" w:cs="Calibri" w:eastAsia="Calibri" w:hAnsi="Calibri"/>
-          <w:i w:val="false"/>
-          <w:iCs w:val="false"/>
-          <w:color w:val="1A1A1A"/>
-          <w:sz w:val="19"/>
-          <w:szCs w:val="19"/>
-        </w:rPr>
-        <w:t xml:space="preserve"> provisioned and administered an AWS EC2 instance running K3s, deploying the service as a 2-replica Kubernetes Deployment behind a streaming API for real-time fund-comparison report generation.</w:t>
-      </w:r>
-    </w:p>
-    <w:p>
-      <w:pPr>
-        <w:pStyle w:val="ListParagraph"/>
-        <w:numPr>
-          <w:ilvl w:val="0"/>
-          <w:numId w:val="2"/>
-        </w:numPr>
-        <w:spacing w:after="45"/>
-      </w:pPr>
-      <w:r>
-        <w:rPr>
-          <w:rFonts w:ascii="Calibri" w:cs="Calibri" w:eastAsia="Calibri" w:hAnsi="Calibri"/>
-          <w:b/>
-          <w:bCs/>
-          <w:i w:val="false"/>
-          <w:iCs w:val="false"/>
-          <w:color w:val="1A1A1A"/>
-          <w:sz w:val="19"/>
-          <w:szCs w:val="19"/>
-        </w:rPr>
-        <w:t xml:space="preserve">Infrastructure &amp; Secrets:</w:t>
-      </w:r>
-      <w:r>
-        <w:rPr>
-          <w:rFonts w:ascii="Calibri" w:cs="Calibri" w:eastAsia="Calibri" w:hAnsi="Calibri"/>
-          <w:i w:val="false"/>
-          <w:iCs w:val="false"/>
-          <w:color w:val="1A1A1A"/>
-          <w:sz w:val="19"/>
-          <w:szCs w:val="19"/>
-        </w:rPr>
-        <w:t xml:space="preserve"> configured EC2 security groups/networking and managed credentials (Supabase, OpenAI) via Kubernetes Secrets rather than embedding them in the container image.</w:t>
+        <w:t xml:space="preserve">Python, FastAPI, Next.js, Supabase/pgvector, Unsloth, Ollama  |  Solo-built, Aug 2026 — ~7,300 LOC — non-clinical, synthetic-data-only (MITRE Synthea)</w:t>
+      </w:r>
+    </w:p>
+    <w:p>
+      <w:pPr>
+        <w:pStyle w:val="ListParagraph"/>
+        <w:numPr>
+          <w:ilvl w:val="0"/>
+          <w:numId w:val="2"/>
+        </w:numPr>
+        <w:spacing w:after="45"/>
+      </w:pPr>
+      <w:r>
+        <w:rPr>
+          <w:rFonts w:ascii="Calibri" w:cs="Calibri" w:eastAsia="Calibri" w:hAnsi="Calibri"/>
+          <w:b/>
+          <w:bCs/>
+          <w:i w:val="false"/>
+          <w:iCs w:val="false"/>
+          <w:color w:val="1A1A1A"/>
+          <w:sz w:val="19"/>
+          <w:szCs w:val="19"/>
+        </w:rPr>
+        <w:t xml:space="preserve">Agentic Citation-Grounded RAG:</w:t>
+      </w:r>
+      <w:r>
+        <w:rPr>
+          <w:rFonts w:ascii="Calibri" w:cs="Calibri" w:eastAsia="Calibri" w:hAnsi="Calibri"/>
+          <w:i w:val="false"/>
+          <w:iCs w:val="false"/>
+          <w:color w:val="1A1A1A"/>
+          <w:sz w:val="19"/>
+          <w:szCs w:val="19"/>
+        </w:rPr>
+        <w:t xml:space="preserve"> built a bounded-tool-loop document agent (list_documents/search_documents) with query reformulation and mandatory citation validation against Postgres full-text (GIN tsvector) indexes, backed by 4 automated ingestion pipelines (OpenFDA drug monographs, PubMed E-Utilities, ADA/AHA/KDIGO clinical guidelines, media transcripts) that indexed 37 documents into 620 searchable chunks.</w:t>
+      </w:r>
+    </w:p>
+    <w:p>
+      <w:pPr>
+        <w:pStyle w:val="ListParagraph"/>
+        <w:numPr>
+          <w:ilvl w:val="0"/>
+          <w:numId w:val="2"/>
+        </w:numPr>
+        <w:spacing w:after="45"/>
+      </w:pPr>
+      <w:r>
+        <w:rPr>
+          <w:rFonts w:ascii="Calibri" w:cs="Calibri" w:eastAsia="Calibri" w:hAnsi="Calibri"/>
+          <w:b/>
+          <w:bCs/>
+          <w:i w:val="false"/>
+          <w:iCs w:val="false"/>
+          <w:color w:val="1A1A1A"/>
+          <w:sz w:val="19"/>
+          <w:szCs w:val="19"/>
+        </w:rPr>
+        <w:t xml:space="preserve">RAFT Fine-Tuning:</w:t>
+      </w:r>
+      <w:r>
+        <w:rPr>
+          <w:rFonts w:ascii="Calibri" w:cs="Calibri" w:eastAsia="Calibri" w:hAnsi="Calibri"/>
+          <w:i w:val="false"/>
+          <w:iCs w:val="false"/>
+          <w:color w:val="1A1A1A"/>
+          <w:sz w:val="19"/>
+          <w:szCs w:val="19"/>
+        </w:rPr>
+        <w:t xml:space="preserve"> designed and ran a Retrieval-Augmented Fine-Tuning pipeline generating training data with oracle evidence, hard distractors, and 20% abstention cases, then fine-tuned Qwen2.5-7B-Instruct via 4-bit QLoRA (Unsloth, rank 16/alpha 32) — achieving 88.5% citation precision, 92.3% citation recall, 84.6% distractor rejection, and 84.6% abstention accuracy on held-out clinical QA.</w:t>
+      </w:r>
+    </w:p>
+    <w:p>
+      <w:pPr>
+        <w:pStyle w:val="ListParagraph"/>
+        <w:numPr>
+          <w:ilvl w:val="0"/>
+          <w:numId w:val="2"/>
+        </w:numPr>
+        <w:spacing w:after="45"/>
+      </w:pPr>
+      <w:r>
+        <w:rPr>
+          <w:rFonts w:ascii="Calibri" w:cs="Calibri" w:eastAsia="Calibri" w:hAnsi="Calibri"/>
+          <w:b/>
+          <w:bCs/>
+          <w:i w:val="false"/>
+          <w:iCs w:val="false"/>
+          <w:color w:val="1A1A1A"/>
+          <w:sz w:val="19"/>
+          <w:szCs w:val="19"/>
+        </w:rPr>
+        <w:t xml:space="preserve">Local Model Serving:</w:t>
+      </w:r>
+      <w:r>
+        <w:rPr>
+          <w:rFonts w:ascii="Calibri" w:cs="Calibri" w:eastAsia="Calibri" w:hAnsi="Calibri"/>
+          <w:i w:val="false"/>
+          <w:iCs w:val="false"/>
+          <w:color w:val="1A1A1A"/>
+          <w:sz w:val="19"/>
+          <w:szCs w:val="19"/>
+        </w:rPr>
+        <w:t xml:space="preserve"> quantized the fine-tuned model to GGUF and deployed it behind Ollama for zero-cost local inference, with an OpenRouter (Nemotron 3 Ultra) cloud fallback for the base agent.</w:t>
+      </w:r>
+    </w:p>
+    <w:p>
+      <w:pPr>
+        <w:pStyle w:val="ListParagraph"/>
+        <w:numPr>
+          <w:ilvl w:val="0"/>
+          <w:numId w:val="2"/>
+        </w:numPr>
+        <w:spacing w:after="45"/>
+      </w:pPr>
+      <w:r>
+        <w:rPr>
+          <w:rFonts w:ascii="Calibri" w:cs="Calibri" w:eastAsia="Calibri" w:hAnsi="Calibri"/>
+          <w:b/>
+          <w:bCs/>
+          <w:i w:val="false"/>
+          <w:iCs w:val="false"/>
+          <w:color w:val="1A1A1A"/>
+          <w:sz w:val="19"/>
+          <w:szCs w:val="19"/>
+        </w:rPr>
+        <w:t xml:space="preserve">Human-in-the-Loop Data Agent:</w:t>
+      </w:r>
+      <w:r>
+        <w:rPr>
+          <w:rFonts w:ascii="Calibri" w:cs="Calibri" w:eastAsia="Calibri" w:hAnsi="Calibri"/>
+          <w:i w:val="false"/>
+          <w:iCs w:val="false"/>
+          <w:color w:val="1A1A1A"/>
+          <w:sz w:val="19"/>
+          <w:szCs w:val="19"/>
+        </w:rPr>
+        <w:t xml:space="preserve"> built a second agent for synthetic clinical data ingestion (10 patients, 479 encounters, 300 conditions, 5,368 observations, 296 medications across 18 FHIR R4 tables) with mandatory human-approval gates around autonomous data operations.</w:t>
+      </w:r>
+    </w:p>
+    <w:p>
+      <w:pPr>
+        <w:pStyle w:val="ListParagraph"/>
+        <w:numPr>
+          <w:ilvl w:val="0"/>
+          <w:numId w:val="2"/>
+        </w:numPr>
+        <w:spacing w:after="45"/>
+      </w:pPr>
+      <w:r>
+        <w:rPr>
+          <w:rFonts w:ascii="Calibri" w:cs="Calibri" w:eastAsia="Calibri" w:hAnsi="Calibri"/>
+          <w:b/>
+          <w:bCs/>
+          <w:i w:val="false"/>
+          <w:iCs w:val="false"/>
+          <w:color w:val="1A1A1A"/>
+          <w:sz w:val="19"/>
+          <w:szCs w:val="19"/>
+        </w:rPr>
+        <w:t xml:space="preserve">Full-Stack Delivery:</w:t>
+      </w:r>
+      <w:r>
+        <w:rPr>
+          <w:rFonts w:ascii="Calibri" w:cs="Calibri" w:eastAsia="Calibri" w:hAnsi="Calibri"/>
+          <w:i w:val="false"/>
+          <w:iCs w:val="false"/>
+          <w:color w:val="1A1A1A"/>
+          <w:sz w:val="19"/>
+          <w:szCs w:val="19"/>
+        </w:rPr>
+        <w:t xml:space="preserve"> async FastAPI + SQLAlchemy + Alembic backend and Next.js 15 frontend, Dockerized end-to-end for local and cloud deployment.</w:t>
       </w:r>
     </w:p>
     <w:p>
@@ -871,7 +1129,7 @@
           <w:sz w:val="20"/>
           <w:szCs w:val="20"/>
         </w:rPr>
-        <w:t xml:space="preserve">CareFlow Intelligence — Agentic RAG &amp; Fine-Tuning for Clinical Research</w:t>
+        <w:t>TalentOS — Autonomous Opportunity Intelligence Platform (All Things Agentic Hackathon)</w:t>
       </w:r>
       <w:r>
         <w:t xml:space="preserve">	</w:t>
@@ -894,234 +1152,54 @@
       </w:pPr>
       <w:r>
         <w:rPr>
-          <w:rFonts w:ascii="Calibri" w:cs="Calibri" w:eastAsia="Calibri" w:hAnsi="Calibri"/>
-          <w:i/>
-          <w:iCs/>
-          <w:color w:val="555555"/>
-          <w:sz w:val="18"/>
-          <w:szCs w:val="18"/>
-        </w:rPr>
-        <w:t xml:space="preserve">Python, FastAPI, Next.js, Supabase/pgvector, Unsloth, Ollama  |  Solo-built, Aug 2026 — ~7,300 LOC — non-clinical, synthetic-data-only (MITRE Synthea)</w:t>
-      </w:r>
-    </w:p>
-    <w:p>
-      <w:pPr>
-        <w:pStyle w:val="ListParagraph"/>
-        <w:numPr>
-          <w:ilvl w:val="0"/>
-          <w:numId w:val="2"/>
-        </w:numPr>
-        <w:spacing w:after="45"/>
-      </w:pPr>
-      <w:r>
-        <w:rPr>
-          <w:rFonts w:ascii="Calibri" w:cs="Calibri" w:eastAsia="Calibri" w:hAnsi="Calibri"/>
-          <w:b/>
-          <w:bCs/>
-          <w:i w:val="false"/>
-          <w:iCs w:val="false"/>
-          <w:color w:val="1A1A1A"/>
-          <w:sz w:val="19"/>
-          <w:szCs w:val="19"/>
-        </w:rPr>
-        <w:t xml:space="preserve">Agentic Citation-Grounded RAG:</w:t>
-      </w:r>
-      <w:r>
-        <w:rPr>
-          <w:rFonts w:ascii="Calibri" w:cs="Calibri" w:eastAsia="Calibri" w:hAnsi="Calibri"/>
-          <w:i w:val="false"/>
-          <w:iCs w:val="false"/>
-          <w:color w:val="1A1A1A"/>
-          <w:sz w:val="19"/>
-          <w:szCs w:val="19"/>
-        </w:rPr>
-        <w:t xml:space="preserve"> built a bounded-tool-loop document agent (list_documents/search_documents) with query reformulation and mandatory citation validation against Postgres full-text (GIN tsvector) indexes, backed by 4 automated ingestion pipelines (OpenFDA drug monographs, PubMed E-Utilities, ADA/AHA/KDIGO clinical guidelines, media transcripts) that indexed 37 documents into 620 searchable chunks.</w:t>
-      </w:r>
-    </w:p>
-    <w:p>
-      <w:pPr>
-        <w:pStyle w:val="ListParagraph"/>
-        <w:numPr>
-          <w:ilvl w:val="0"/>
-          <w:numId w:val="2"/>
-        </w:numPr>
-        <w:spacing w:after="45"/>
-      </w:pPr>
-      <w:r>
-        <w:rPr>
-          <w:rFonts w:ascii="Calibri" w:cs="Calibri" w:eastAsia="Calibri" w:hAnsi="Calibri"/>
-          <w:b/>
-          <w:bCs/>
-          <w:i w:val="false"/>
-          <w:iCs w:val="false"/>
-          <w:color w:val="1A1A1A"/>
-          <w:sz w:val="19"/>
-          <w:szCs w:val="19"/>
-        </w:rPr>
-        <w:t xml:space="preserve">RAFT Fine-Tuning:</w:t>
-      </w:r>
-      <w:r>
-        <w:rPr>
-          <w:rFonts w:ascii="Calibri" w:cs="Calibri" w:eastAsia="Calibri" w:hAnsi="Calibri"/>
-          <w:i w:val="false"/>
-          <w:iCs w:val="false"/>
-          <w:color w:val="1A1A1A"/>
-          <w:sz w:val="19"/>
-          <w:szCs w:val="19"/>
-        </w:rPr>
-        <w:t xml:space="preserve"> designed and ran a Retrieval-Augmented Fine-Tuning pipeline generating training data with oracle evidence, hard distractors, and 20% abstention cases, then fine-tuned Qwen2.5-7B-Instruct via 4-bit QLoRA (Unsloth, rank 16/alpha 32) — achieving 88.5% citation precision, 92.3% citation recall, 84.6% distractor rejection, and 84.6% abstention accuracy on held-out clinical QA.</w:t>
-      </w:r>
-    </w:p>
-    <w:p>
-      <w:pPr>
-        <w:pStyle w:val="ListParagraph"/>
-        <w:numPr>
-          <w:ilvl w:val="0"/>
-          <w:numId w:val="2"/>
-        </w:numPr>
-        <w:spacing w:after="45"/>
-      </w:pPr>
-      <w:r>
-        <w:rPr>
-          <w:rFonts w:ascii="Calibri" w:cs="Calibri" w:eastAsia="Calibri" w:hAnsi="Calibri"/>
-          <w:b/>
-          <w:bCs/>
-          <w:i w:val="false"/>
-          <w:iCs w:val="false"/>
-          <w:color w:val="1A1A1A"/>
-          <w:sz w:val="19"/>
-          <w:szCs w:val="19"/>
-        </w:rPr>
-        <w:t xml:space="preserve">Local Model Serving:</w:t>
-      </w:r>
-      <w:r>
-        <w:rPr>
-          <w:rFonts w:ascii="Calibri" w:cs="Calibri" w:eastAsia="Calibri" w:hAnsi="Calibri"/>
-          <w:i w:val="false"/>
-          <w:iCs w:val="false"/>
-          <w:color w:val="1A1A1A"/>
-          <w:sz w:val="19"/>
-          <w:szCs w:val="19"/>
-        </w:rPr>
-        <w:t xml:space="preserve"> quantized the fine-tuned model to GGUF and deployed it behind Ollama for zero-cost local inference, with an OpenRouter (Nemotron 3 Ultra) cloud fallback for the base agent.</w:t>
-      </w:r>
-    </w:p>
-    <w:p>
-      <w:pPr>
-        <w:pStyle w:val="ListParagraph"/>
-        <w:numPr>
-          <w:ilvl w:val="0"/>
-          <w:numId w:val="2"/>
-        </w:numPr>
-        <w:spacing w:after="45"/>
-      </w:pPr>
-      <w:r>
-        <w:rPr>
-          <w:rFonts w:ascii="Calibri" w:cs="Calibri" w:eastAsia="Calibri" w:hAnsi="Calibri"/>
-          <w:b/>
-          <w:bCs/>
-          <w:i w:val="false"/>
-          <w:iCs w:val="false"/>
-          <w:color w:val="1A1A1A"/>
-          <w:sz w:val="19"/>
-          <w:szCs w:val="19"/>
-        </w:rPr>
-        <w:t xml:space="preserve">Human-in-the-Loop Data Agent:</w:t>
-      </w:r>
-      <w:r>
-        <w:rPr>
-          <w:rFonts w:ascii="Calibri" w:cs="Calibri" w:eastAsia="Calibri" w:hAnsi="Calibri"/>
-          <w:i w:val="false"/>
-          <w:iCs w:val="false"/>
-          <w:color w:val="1A1A1A"/>
-          <w:sz w:val="19"/>
-          <w:szCs w:val="19"/>
-        </w:rPr>
-        <w:t xml:space="preserve"> built a second agent for synthetic clinical data ingestion (10 patients, 479 encounters, 300 conditions, 5,368 observations, 296 medications across 18 FHIR R4 tables) with mandatory human-approval gates around autonomous data operations.</w:t>
-      </w:r>
-    </w:p>
-    <w:p>
-      <w:pPr>
-        <w:pStyle w:val="ListParagraph"/>
-        <w:numPr>
-          <w:ilvl w:val="0"/>
-          <w:numId w:val="2"/>
-        </w:numPr>
-        <w:spacing w:after="45"/>
-      </w:pPr>
-      <w:r>
-        <w:rPr>
-          <w:rFonts w:ascii="Calibri" w:cs="Calibri" w:eastAsia="Calibri" w:hAnsi="Calibri"/>
-          <w:b/>
-          <w:bCs/>
-          <w:i w:val="false"/>
-          <w:iCs w:val="false"/>
-          <w:color w:val="1A1A1A"/>
-          <w:sz w:val="19"/>
-          <w:szCs w:val="19"/>
-        </w:rPr>
-        <w:t xml:space="preserve">Full-Stack Delivery:</w:t>
-      </w:r>
-      <w:r>
-        <w:rPr>
-          <w:rFonts w:ascii="Calibri" w:cs="Calibri" w:eastAsia="Calibri" w:hAnsi="Calibri"/>
-          <w:i w:val="false"/>
-          <w:iCs w:val="false"/>
-          <w:color w:val="1A1A1A"/>
-          <w:sz w:val="19"/>
-          <w:szCs w:val="19"/>
-        </w:rPr>
-        <w:t xml:space="preserve"> async FastAPI + SQLAlchemy + Alembic backend and Next.js 15 frontend, Dockerized end-to-end for local and cloud deployment.</w:t>
-      </w:r>
-    </w:p>
-    <w:p>
-      <w:pPr>
-        <w:tabs>
-          <w:tab w:val="right" w:pos="9026"/>
-        </w:tabs>
-        <w:spacing w:after="20" w:before="90"/>
-      </w:pPr>
-      <w:r>
-        <w:rPr>
-          <w:rFonts w:ascii="Calibri" w:cs="Calibri" w:eastAsia="Calibri" w:hAnsi="Calibri"/>
-          <w:b/>
-          <w:bCs/>
-          <w:color w:val="1A1A1A"/>
-          <w:sz w:val="20"/>
-          <w:szCs w:val="20"/>
-        </w:rPr>
-        <w:t xml:space="preserve">TalentOS — Autonomous Job &amp; Freelance-Lead Platform (Hackathon)</w:t>
-      </w:r>
-      <w:r>
-        <w:t xml:space="preserve">	</w:t>
-      </w:r>
-      <w:r>
-        <w:rPr>
-          <w:rFonts w:ascii="Calibri" w:cs="Calibri" w:eastAsia="Calibri" w:hAnsi="Calibri"/>
-          <w:i/>
-          <w:iCs/>
-          <w:color w:val="555555"/>
-          <w:sz w:val="19"/>
-          <w:szCs w:val="19"/>
-        </w:rPr>
-        <w:t xml:space="preserve"/>
-      </w:r>
-    </w:p>
-    <w:p>
-      <w:pPr>
-        <w:spacing w:after="60"/>
-      </w:pPr>
-      <w:r>
-        <w:rPr>
-          <w:rFonts w:ascii="Calibri" w:cs="Calibri" w:eastAsia="Calibri" w:hAnsi="Calibri"/>
-          <w:i/>
-          <w:iCs/>
-          <w:color w:val="555555"/>
-          <w:sz w:val="18"/>
-          <w:szCs w:val="18"/>
-        </w:rPr>
-        <w:t xml:space="preserve">Python, Google ADK, LangGraph, Next.js, Firestore, GCP  |  Solo-built, Aug 2026 — ~17.3K LOC across 107 files, 30 commits, 235+ test suite</w:t>
-      </w:r>
+          <w:i/>
+        </w:rPr>
+        <w:t>Python, Google ADK, LangGraph, Next.js, Firestore, Google Cloud Run  |  Solo-built, Aug 2026 — ~22K LOC across 130 files, 56 commits, 235+ test suite</w:t>
+      </w:r>
+      <w:r>
+        <w:rPr>
+          <w:i/>
+        </w:rPr>
+        <w:t xml:space="preserve">  |  </w:t>
+      </w:r>
+      <w:r>
+        <w:rPr>
+          <w:i/>
+        </w:rPr>
+        <w:t xml:space="preserve">Live: </w:t>
+      </w:r>
+      <w:hyperlink r:id="rId10">
+        <w:r>
+          <w:rPr>
+            <w:color w:val="0066CC"/>
+            <w:u w:val="single"/>
+            <w:i/>
+          </w:rPr>
+          <w:t>all-things-agentic--allthingsage...</w:t>
+        </w:r>
+      </w:hyperlink>
+      <w:r>
+        <w:rPr>
+          <w:i/>
+        </w:rPr>
+        <w:t xml:space="preserve"> | </w:t>
+      </w:r>
+      <w:r>
+        <w:rPr>
+          <w:i/>
+        </w:rPr>
+        <w:t xml:space="preserve">Repo: </w:t>
+      </w:r>
+      <w:hyperlink r:id="rId11">
+        <w:r>
+          <w:rPr>
+            <w:color w:val="0066CC"/>
+            <w:u w:val="single"/>
+            <w:i/>
+          </w:rPr>
+          <w:t>github.com/Naman6019/all-things-agentic</w:t>
+        </w:r>
+      </w:hyperlink>
     </w:p>
     <w:p>
       <w:pPr>

</xml_diff>

<commit_message>
chore(resume): sync latest resume variants
Auto-synced by GitResume Agent.
</commit_message>
<xml_diff>
--- a/public/resume/Naman_Manocha_Master_Resume.docx
+++ b/public/resume/Naman_Manocha_Master_Resume.docx
@@ -89,7 +89,7 @@
         <w:pBdr>
           <w:bottom w:val="single" w:color="1F4E5F" w:sz="6" w:space="2"/>
         </w:pBdr>
-        <w:spacing w:after="60" w:before="160"/>
+        <w:spacing w:after="60" w:before="120"/>
       </w:pPr>
       <w:r>
         <w:rPr>
@@ -160,7 +160,7 @@
         <w:pBdr>
           <w:bottom w:val="single" w:color="1F4E5F" w:sz="6" w:space="2"/>
         </w:pBdr>
-        <w:spacing w:after="60" w:before="160"/>
+        <w:spacing w:after="60" w:before="120"/>
       </w:pPr>
       <w:r>
         <w:rPr>
@@ -201,7 +201,7 @@
           <w:sz w:val="19"/>
           <w:szCs w:val="19"/>
         </w:rPr>
-        <w:t xml:space="preserve"> LLMs, RAG (LangGraph), Multi-Agent Orchestration (LangGraph, Google ADK), Hybrid Search, Prompt Engineering (few-shot, CoT), Hugging Face, Ollama, Vector Embeddings (pgvector), K-Means Clustering, Logistic Regression, AI Observability (Langfuse), MLflow, scikit-learn</w:t>
+        <w:t xml:space="preserve"> LLMs, RAG (LangGraph), Multi-Agent Orchestration (LangGraph, Google ADK), Hybrid Search, Prompt Engineering (few-shot, CoT), Hugging Face, Ollama, Vector Embeddings (pgvector, ChromaDB), K-Means Clustering, Logistic Regression, AI Observability (Langfuse), MLflow, scikit-learn</w:t>
       </w:r>
     </w:p>
     <w:p>
@@ -267,7 +267,7 @@
         <w:pBdr>
           <w:bottom w:val="single" w:color="1F4E5F" w:sz="6" w:space="2"/>
         </w:pBdr>
-        <w:spacing w:after="60" w:before="160"/>
+        <w:spacing w:after="60" w:before="120"/>
       </w:pPr>
       <w:r>
         <w:rPr>
@@ -338,7 +338,7 @@
           <w:ilvl w:val="0"/>
           <w:numId w:val="2"/>
         </w:numPr>
-        <w:spacing w:after="45"/>
+        <w:spacing w:after="40"/>
       </w:pPr>
       <w:r>
         <w:rPr>
@@ -359,7 +359,7 @@
           <w:ilvl w:val="0"/>
           <w:numId w:val="2"/>
         </w:numPr>
-        <w:spacing w:after="45"/>
+        <w:spacing w:after="40"/>
       </w:pPr>
       <w:r>
         <w:rPr>
@@ -380,7 +380,7 @@
           <w:ilvl w:val="0"/>
           <w:numId w:val="2"/>
         </w:numPr>
-        <w:spacing w:after="45"/>
+        <w:spacing w:after="40"/>
       </w:pPr>
       <w:r>
         <w:rPr>
@@ -401,7 +401,7 @@
           <w:ilvl w:val="0"/>
           <w:numId w:val="2"/>
         </w:numPr>
-        <w:spacing w:after="45"/>
+        <w:spacing w:after="40"/>
       </w:pPr>
       <w:r>
         <w:rPr>
@@ -420,7 +420,7 @@
         <w:pBdr>
           <w:bottom w:val="single" w:color="1F4E5F" w:sz="6" w:space="2"/>
         </w:pBdr>
-        <w:spacing w:after="60" w:before="160"/>
+        <w:spacing w:after="60" w:before="120"/>
       </w:pPr>
       <w:r>
         <w:rPr>
@@ -492,7 +492,7 @@
         <w:rPr>
           <w:i/>
         </w:rPr>
-        <w:t>Solo-built, Apr–Aug 2026 — ~132K lines of code across 752 files, 410 commits, 142+ test suites — submitted to OpenAI Build Week</w:t>
+        <w:t>Solo-built, Apr–Aug 2026 — ~143K lines of code across 864 files, 430 commits, 167+ test suites — submitted to OpenAI Build Week</w:t>
       </w:r>
       <w:r>
         <w:rPr>
@@ -546,7 +546,7 @@
           <w:ilvl w:val="0"/>
           <w:numId w:val="2"/>
         </w:numPr>
-        <w:spacing w:after="45"/>
+        <w:spacing w:after="40"/>
       </w:pPr>
       <w:r>
         <w:rPr>
@@ -580,7 +580,7 @@
           <w:ilvl w:val="0"/>
           <w:numId w:val="2"/>
         </w:numPr>
-        <w:spacing w:after="45"/>
+        <w:spacing w:after="40"/>
       </w:pPr>
       <w:r>
         <w:rPr>
@@ -614,7 +614,7 @@
           <w:ilvl w:val="0"/>
           <w:numId w:val="2"/>
         </w:numPr>
-        <w:spacing w:after="45"/>
+        <w:spacing w:after="40"/>
       </w:pPr>
       <w:r>
         <w:rPr>
@@ -648,7 +648,7 @@
           <w:ilvl w:val="0"/>
           <w:numId w:val="2"/>
         </w:numPr>
-        <w:spacing w:after="45"/>
+        <w:spacing w:after="40"/>
       </w:pPr>
       <w:r>
         <w:rPr>
@@ -682,7 +682,7 @@
           <w:ilvl w:val="0"/>
           <w:numId w:val="2"/>
         </w:numPr>
-        <w:spacing w:after="45"/>
+        <w:spacing w:after="40"/>
       </w:pPr>
       <w:r>
         <w:rPr>
@@ -716,7 +716,7 @@
           <w:ilvl w:val="0"/>
           <w:numId w:val="2"/>
         </w:numPr>
-        <w:spacing w:after="45"/>
+        <w:spacing w:after="40"/>
       </w:pPr>
       <w:r>
         <w:rPr>
@@ -745,6 +745,7 @@
     </w:p>
     <w:p>
       <w:pPr>
+        <w:pageBreakBefore/>
         <w:tabs>
           <w:tab w:val="right" w:pos="9026"/>
         </w:tabs>
@@ -799,7 +800,7 @@
           <w:ilvl w:val="0"/>
           <w:numId w:val="2"/>
         </w:numPr>
-        <w:spacing w:after="45"/>
+        <w:spacing w:after="40"/>
       </w:pPr>
       <w:r>
         <w:rPr>
@@ -833,7 +834,7 @@
           <w:ilvl w:val="0"/>
           <w:numId w:val="2"/>
         </w:numPr>
-        <w:spacing w:after="45"/>
+        <w:spacing w:after="40"/>
       </w:pPr>
       <w:r>
         <w:rPr>
@@ -867,7 +868,7 @@
           <w:ilvl w:val="0"/>
           <w:numId w:val="2"/>
         </w:numPr>
-        <w:spacing w:after="45"/>
+        <w:spacing w:after="40"/>
       </w:pPr>
       <w:r>
         <w:rPr>
@@ -940,17 +941,17 @@
           <w:sz w:val="18"/>
           <w:szCs w:val="18"/>
         </w:rPr>
-        <w:t xml:space="preserve">Python, FastAPI, Next.js, Supabase/pgvector, Unsloth, Ollama  |  Solo-built, Aug 2026 — ~7,300 LOC — non-clinical, synthetic-data-only (MITRE Synthea)</w:t>
-      </w:r>
-    </w:p>
-    <w:p>
-      <w:pPr>
-        <w:pStyle w:val="ListParagraph"/>
-        <w:numPr>
-          <w:ilvl w:val="0"/>
-          <w:numId w:val="2"/>
-        </w:numPr>
-        <w:spacing w:after="45"/>
+        <w:t>Python, FastAPI, Next.js, Supabase/pgvector, ChromaDB, Unsloth, Ollama  |  Solo-built, Aug 2026 — ~7,300 LOC — non-clinical, synthetic-data-only (MITRE Synthea)</w:t>
+      </w:r>
+    </w:p>
+    <w:p>
+      <w:pPr>
+        <w:pStyle w:val="ListParagraph"/>
+        <w:numPr>
+          <w:ilvl w:val="0"/>
+          <w:numId w:val="2"/>
+        </w:numPr>
+        <w:spacing w:after="40"/>
       </w:pPr>
       <w:r>
         <w:rPr>
@@ -984,7 +985,7 @@
           <w:ilvl w:val="0"/>
           <w:numId w:val="2"/>
         </w:numPr>
-        <w:spacing w:after="45"/>
+        <w:spacing w:after="40"/>
       </w:pPr>
       <w:r>
         <w:rPr>
@@ -1018,7 +1019,7 @@
           <w:ilvl w:val="0"/>
           <w:numId w:val="2"/>
         </w:numPr>
-        <w:spacing w:after="45"/>
+        <w:spacing w:after="40"/>
       </w:pPr>
       <w:r>
         <w:rPr>
@@ -1052,7 +1053,7 @@
           <w:ilvl w:val="0"/>
           <w:numId w:val="2"/>
         </w:numPr>
-        <w:spacing w:after="45"/>
+        <w:spacing w:after="40"/>
       </w:pPr>
       <w:r>
         <w:rPr>
@@ -1086,7 +1087,7 @@
           <w:ilvl w:val="0"/>
           <w:numId w:val="2"/>
         </w:numPr>
-        <w:spacing w:after="45"/>
+        <w:spacing w:after="40"/>
       </w:pPr>
       <w:r>
         <w:rPr>
@@ -1154,7 +1155,7 @@
         <w:rPr>
           <w:i/>
         </w:rPr>
-        <w:t>Python, Google ADK, LangGraph, Next.js, Firestore, Google Cloud Run  |  Solo-built, Aug 2026 — ~22K LOC across 130 files, 56 commits, 235+ test suite</w:t>
+        <w:t>Python, Google ADK, LangGraph, Next.js, Firestore, Google Cloud Run  |  Solo-built, Aug 2026 — ~23K LOC across 131 files, 69 commits, 235+ test suite</w:t>
       </w:r>
       <w:r>
         <w:rPr>
@@ -1208,7 +1209,7 @@
           <w:ilvl w:val="0"/>
           <w:numId w:val="2"/>
         </w:numPr>
-        <w:spacing w:after="45"/>
+        <w:spacing w:after="40"/>
       </w:pPr>
       <w:r>
         <w:rPr>
@@ -1242,7 +1243,7 @@
           <w:ilvl w:val="0"/>
           <w:numId w:val="2"/>
         </w:numPr>
-        <w:spacing w:after="45"/>
+        <w:spacing w:after="40"/>
       </w:pPr>
       <w:r>
         <w:rPr>
@@ -1276,7 +1277,7 @@
           <w:ilvl w:val="0"/>
           <w:numId w:val="2"/>
         </w:numPr>
-        <w:spacing w:after="45"/>
+        <w:spacing w:after="40"/>
       </w:pPr>
       <w:r>
         <w:rPr>
@@ -1310,7 +1311,7 @@
           <w:ilvl w:val="0"/>
           <w:numId w:val="2"/>
         </w:numPr>
-        <w:spacing w:after="45"/>
+        <w:spacing w:after="40"/>
       </w:pPr>
       <w:r>
         <w:rPr>
@@ -1393,7 +1394,7 @@
           <w:ilvl w:val="0"/>
           <w:numId w:val="2"/>
         </w:numPr>
-        <w:spacing w:after="45"/>
+        <w:spacing w:after="40"/>
       </w:pPr>
       <w:r>
         <w:rPr>
@@ -1405,6 +1406,55 @@
           <w:szCs w:val="19"/>
         </w:rPr>
         <w:t xml:space="preserve">Compared BERT, BiDAF, and DistilBERT for extractive QA; fine-tuned each and built a standardized evaluation pipeline (accuracy, precision, recall, F1); published as a research paper.</w:t>
+      </w:r>
+    </w:p>
+    <w:p>
+      <w:r>
+        <w:rPr>
+          <w:rFonts w:ascii="Calibri" w:hAnsi="Calibri"/>
+          <w:b/>
+          <w:sz w:val="20"/>
+        </w:rPr>
+        <w:t>GitResume — Autonomous Resume &amp; Portfolio Intelligence Agent</w:t>
+        <w:tab/>
+      </w:r>
+    </w:p>
+    <w:p>
+      <w:r>
+        <w:rPr>
+          <w:i/>
+        </w:rPr>
+        <w:t>Python, Typer, Rich, Ollama, python-docx  |  ~3K LOC across 23 files, 21 commits</w:t>
+      </w:r>
+      <w:r>
+        <w:rPr>
+          <w:i/>
+        </w:rPr>
+        <w:t xml:space="preserve">  |  </w:t>
+      </w:r>
+      <w:r>
+        <w:rPr>
+          <w:i/>
+        </w:rPr>
+        <w:t xml:space="preserve">Repo: </w:t>
+      </w:r>
+      <w:hyperlink r:id="rId12">
+        <w:r>
+          <w:rPr>
+            <w:color w:val="0066CC"/>
+            <w:u w:val="single"/>
+            <w:i/>
+          </w:rPr>
+          <w:t>github.com/Naman6019/git-resume-agent</w:t>
+        </w:r>
+      </w:hyperlink>
+    </w:p>
+    <w:p>
+      <w:pPr>
+        <w:pStyle w:val="ListParagraph"/>
+      </w:pPr>
+      <w:r>
+        <w:t>Self-built a multi-agent pipeline (Inspector → SchemaDiscoverer → Synthesizer → GroundingVerifier) that scans git history/AST, synthesizes quantified resume bullets via LLM, and adversarially verifies every metric against commit diffs before compiling to Word/PDF with native hyperlinks — published to PyPI as git-resume-agent; runs on every commit via a git hook.</w:t>
       </w:r>
     </w:p>
     <w:p>
@@ -1412,7 +1462,7 @@
         <w:pBdr>
           <w:bottom w:val="single" w:color="1F4E5F" w:sz="6" w:space="2"/>
         </w:pBdr>
-        <w:spacing w:after="60" w:before="160"/>
+        <w:spacing w:after="60" w:before="120"/>
       </w:pPr>
       <w:r>
         <w:rPr>
@@ -1483,7 +1533,7 @@
           <w:ilvl w:val="0"/>
           <w:numId w:val="2"/>
         </w:numPr>
-        <w:spacing w:after="45"/>
+        <w:spacing w:after="40"/>
       </w:pPr>
       <w:r>
         <w:rPr>
@@ -1504,7 +1554,7 @@
           <w:ilvl w:val="0"/>
           <w:numId w:val="2"/>
         </w:numPr>
-        <w:spacing w:after="45"/>
+        <w:spacing w:after="40"/>
       </w:pPr>
       <w:r>
         <w:rPr>
@@ -1520,7 +1570,7 @@
     </w:p>
     <w:sectPr>
       <w:pgSz w:w="12240" w:h="15840" w:orient="portrait"/>
-      <w:pgMar w:top="863" w:right="863" w:bottom="863" w:left="863" w:header="708" w:footer="708" w:gutter="0"/>
+      <w:pgMar w:top="640" w:right="800" w:bottom="640" w:left="800" w:header="708" w:footer="708" w:gutter="0"/>
       <w:pgNumType/>
       <w:docGrid w:linePitch="360"/>
     </w:sectPr>

</xml_diff>